<commit_message>
vault backup: 2026-05-04 22:32:19
</commit_message>
<xml_diff>
--- a/小动物疾病防治/课程论文.docx
+++ b/小动物疾病防治/课程论文.docx
@@ -178,7 +178,13 @@
         <w:rPr>
           <w:rFonts w:hint="eastAsia"/>
         </w:rPr>
-        <w:t>饲养数量</w:t>
+        <w:t>饲养</w:t>
+      </w:r>
+      <w:r>
+        <w:rPr>
+          <w:rFonts w:hint="eastAsia"/>
+        </w:rPr>
+        <w:t>数量</w:t>
       </w:r>
       <w:r>
         <w:t>增加，</w:t>
@@ -187,7 +193,37 @@
         <w:rPr>
           <w:rFonts w:hint="eastAsia"/>
         </w:rPr>
-        <w:t>小动物临床面临一个重要的议题，即如何合理有效进行犬猫的繁殖控制</w:t>
+        <w:t>现实中会</w:t>
+      </w:r>
+      <w:r>
+        <w:rPr>
+          <w:rFonts w:hint="eastAsia"/>
+        </w:rPr>
+        <w:t>面临</w:t>
+      </w:r>
+      <w:r>
+        <w:rPr>
+          <w:rFonts w:hint="eastAsia"/>
+        </w:rPr>
+        <w:t>一个难以忽视的议题</w:t>
+      </w:r>
+      <w:r>
+        <w:rPr>
+          <w:rFonts w:hint="eastAsia"/>
+        </w:rPr>
+        <w:t>，即如何合理有效</w:t>
+      </w:r>
+      <w:r>
+        <w:rPr>
+          <w:rFonts w:hint="eastAsia"/>
+        </w:rPr>
+        <w:t>控制</w:t>
+      </w:r>
+      <w:r>
+        <w:rPr>
+          <w:rFonts w:hint="eastAsia"/>
+        </w:rPr>
+        <w:t>犬猫的繁殖</w:t>
       </w:r>
       <w:r>
         <w:t>。</w:t>
@@ -196,7 +232,19 @@
         <w:rPr>
           <w:rFonts w:hint="eastAsia"/>
         </w:rPr>
-        <w:t>而绝育措施</w:t>
+        <w:t>而绝育</w:t>
+      </w:r>
+      <w:r>
+        <w:rPr>
+          <w:rFonts w:hint="eastAsia"/>
+        </w:rPr>
+        <w:t>这一</w:t>
+      </w:r>
+      <w:r>
+        <w:rPr>
+          <w:rFonts w:hint="eastAsia"/>
+        </w:rPr>
+        <w:t>措施</w:t>
       </w:r>
       <w:r>
         <w:t>不仅</w:t>
@@ -217,7 +265,25 @@
         <w:t>等社会议题息息相关</w:t>
       </w:r>
       <w:r>
-        <w:t>。因此，犬猫绝育并不是一个单纯的“是否繁殖”问题，而是涉及临床、管理和动物福利等多个层面的综合性问题</w:t>
+        <w:t>。因此，犬猫绝育并不是一个</w:t>
+      </w:r>
+      <w:r>
+        <w:rPr>
+          <w:rFonts w:hint="eastAsia"/>
+        </w:rPr>
+        <w:t>简单</w:t>
+      </w:r>
+      <w:r>
+        <w:t>的“是否</w:t>
+      </w:r>
+      <w:r>
+        <w:rPr>
+          <w:rFonts w:hint="eastAsia"/>
+        </w:rPr>
+        <w:t>应该</w:t>
+      </w:r>
+      <w:r>
+        <w:t>繁殖”问题，而是涉及临床、管理和动物福利等多个层面的综合性问题</w:t>
       </w:r>
       <w:r>
         <w:rPr>
@@ -229,18 +295,12 @@
         <w:rPr>
           <w:vertAlign w:val="superscript"/>
         </w:rPr>
-        <w:instrText xml:space="preserve"> REF _Ref228003341 \r \h </w:instrText>
-      </w:r>
-      <w:r>
-        <w:rPr>
-          <w:vertAlign w:val="superscript"/>
-        </w:rPr>
-      </w:r>
-      <w:r>
-        <w:rPr>
-          <w:vertAlign w:val="superscript"/>
-        </w:rPr>
-        <w:instrText xml:space="preserve"> \* MERGEFORMAT </w:instrText>
+        <w:instrText xml:space="preserve"> REF _Ref228545611 \r \h  \* MERGEFORMAT </w:instrText>
+      </w:r>
+      <w:r>
+        <w:rPr>
+          <w:vertAlign w:val="superscript"/>
+        </w:rPr>
       </w:r>
       <w:r>
         <w:rPr>
@@ -252,13 +312,7 @@
         <w:rPr>
           <w:vertAlign w:val="superscript"/>
         </w:rPr>
-        <w:t>[1</w:t>
-      </w:r>
-      <w:r>
-        <w:rPr>
-          <w:vertAlign w:val="superscript"/>
-        </w:rPr>
-        <w:t>]</w:t>
+        <w:t>[1]</w:t>
       </w:r>
       <w:r>
         <w:rPr>
@@ -295,7 +349,7 @@
         <w:t>有</w:t>
       </w:r>
       <w:r>
-        <w:t>手术绝育和药物绝育两大类。手术绝育通常是指通过外科手段去除性腺或相关生殖器官，从而</w:t>
+        <w:t>手术绝育和药物绝育两大类。手术绝育通常是指通过外科手段去除性腺或相关生殖器官而</w:t>
       </w:r>
       <w:r>
         <w:rPr>
@@ -313,16 +367,43 @@
         <w:t>临床实践上</w:t>
       </w:r>
       <w:r>
-        <w:t>，雄性动物多采用去势术，雌性动物则多采用卵巢切除术或卵巢子宫切除术。</w:t>
-      </w:r>
-      <w:r>
-        <w:rPr>
-          <w:rFonts w:hint="eastAsia"/>
-        </w:rPr>
-        <w:t>而</w:t>
-      </w:r>
-      <w:r>
-        <w:t>药物绝育属于非手术性繁殖控制方式，主要是通过激素类药物、促性腺激素释放激素类似物或其他化学方法，抑制发情、干扰生殖激素分泌或降低生育能力。</w:t>
+        <w:t>，雄性动物多采用去势术，雌性动物则多采用卵巢切除术或卵巢子宫切除术</w:t>
+      </w:r>
+      <w:r>
+        <w:rPr>
+          <w:rFonts w:hint="eastAsia"/>
+        </w:rPr>
+        <w:t>；</w:t>
+      </w:r>
+      <w:r>
+        <w:t>药物绝育属于非手术性繁殖控制方式，主要通过激素类药物、促性腺激素释放激素</w:t>
+      </w:r>
+      <w:r>
+        <w:rPr>
+          <w:rFonts w:hint="eastAsia"/>
+        </w:rPr>
+        <w:t>抑制剂</w:t>
+      </w:r>
+      <w:r>
+        <w:t>类似物或其他化学方法，抑制</w:t>
+      </w:r>
+      <w:r>
+        <w:rPr>
+          <w:rFonts w:hint="eastAsia"/>
+        </w:rPr>
+        <w:t>动物本身的</w:t>
+      </w:r>
+      <w:r>
+        <w:t>发情、干扰</w:t>
+      </w:r>
+      <w:r>
+        <w:rPr>
+          <w:rFonts w:hint="eastAsia"/>
+        </w:rPr>
+        <w:t>其</w:t>
+      </w:r>
+      <w:r>
+        <w:t>生殖激素分泌或降低生育能力。</w:t>
       </w:r>
     </w:p>
     <w:p>
@@ -332,6 +413,7 @@
         <w:ind w:firstLineChars="200" w:firstLine="480"/>
       </w:pPr>
       <w:r>
+        <w:lastRenderedPageBreak/>
         <w:t>本文将围绕</w:t>
       </w:r>
       <w:r>
@@ -365,14 +447,31 @@
         <w:rPr>
           <w:rFonts w:hint="eastAsia"/>
         </w:rPr>
-        <w:t>讨论各自的</w:t>
-      </w:r>
-      <w:r>
-        <w:t>优缺点，并进一步比较二者在避孕效果、持续时间、可逆性、安全性以及临床适用范围等方面的差异。通过</w:t>
-      </w:r>
-      <w:r>
-        <w:lastRenderedPageBreak/>
-        <w:t>对相关指南和研究结论的整理，本文希望能够较为全面地认识药物绝育与手术绝育各自的优势与局限，</w:t>
+        <w:t>讨论</w:t>
+      </w:r>
+      <w:r>
+        <w:rPr>
+          <w:rFonts w:hint="eastAsia"/>
+        </w:rPr>
+        <w:t>二者</w:t>
+      </w:r>
+      <w:r>
+        <w:rPr>
+          <w:rFonts w:hint="eastAsia"/>
+        </w:rPr>
+        <w:t>的</w:t>
+      </w:r>
+      <w:r>
+        <w:t>优缺点，并进一步比较在避孕效果、持续时间、可逆性、安全性以及临床适用范围等</w:t>
+      </w:r>
+      <w:r>
+        <w:rPr>
+          <w:rFonts w:hint="eastAsia"/>
+        </w:rPr>
+        <w:t>多</w:t>
+      </w:r>
+      <w:r>
+        <w:t>方面的差异。通过对相关指南和研究结论的整理，本文希望能够较为全面地认识药物绝育与手术绝育各自的优势与局限，</w:t>
       </w:r>
       <w:r>
         <w:rPr>
@@ -495,18 +594,12 @@
         <w:rPr>
           <w:vertAlign w:val="superscript"/>
         </w:rPr>
-        <w:instrText xml:space="preserve"> REF _Ref228003341 \r \h </w:instrText>
-      </w:r>
-      <w:r>
-        <w:rPr>
-          <w:vertAlign w:val="superscript"/>
-        </w:rPr>
-      </w:r>
-      <w:r>
-        <w:rPr>
-          <w:vertAlign w:val="superscript"/>
-        </w:rPr>
-        <w:instrText xml:space="preserve"> \* MERGEFORMAT </w:instrText>
+        <w:instrText xml:space="preserve"> REF _Ref228545611 \r \h  \* MERGEFORMAT </w:instrText>
+      </w:r>
+      <w:r>
+        <w:rPr>
+          <w:vertAlign w:val="superscript"/>
+        </w:rPr>
       </w:r>
       <w:r>
         <w:rPr>
@@ -533,7 +626,19 @@
         <w:rPr>
           <w:rFonts w:hint="eastAsia"/>
         </w:rPr>
-        <w:t>从当前临床实施上来看，</w:t>
+        <w:t>从当前临床</w:t>
+      </w:r>
+      <w:r>
+        <w:rPr>
+          <w:rFonts w:hint="eastAsia"/>
+        </w:rPr>
+        <w:t>实战</w:t>
+      </w:r>
+      <w:r>
+        <w:rPr>
+          <w:rFonts w:hint="eastAsia"/>
+        </w:rPr>
+        <w:t>上来看，</w:t>
       </w:r>
       <w:r>
         <w:t>手术绝育的操作流程成熟、经验积累丰富</w:t>
@@ -575,18 +680,12 @@
         <w:rPr>
           <w:vertAlign w:val="superscript"/>
         </w:rPr>
-        <w:instrText xml:space="preserve"> REF _Ref228003424 \r \h </w:instrText>
-      </w:r>
-      <w:r>
-        <w:rPr>
-          <w:vertAlign w:val="superscript"/>
-        </w:rPr>
-      </w:r>
-      <w:r>
-        <w:rPr>
-          <w:vertAlign w:val="superscript"/>
-        </w:rPr>
-        <w:instrText xml:space="preserve"> \* MERGEFORMAT </w:instrText>
+        <w:instrText xml:space="preserve"> REF _Ref228545688 \r \h  \* MERGEFORMAT </w:instrText>
+      </w:r>
+      <w:r>
+        <w:rPr>
+          <w:vertAlign w:val="superscript"/>
+        </w:rPr>
       </w:r>
       <w:r>
         <w:rPr>
@@ -620,7 +719,43 @@
         <w:ind w:firstLineChars="200" w:firstLine="480"/>
       </w:pPr>
       <w:r>
-        <w:t>对于雌性犬猫而言，手术绝育在预防某些生殖系统疾病方面具有明确优势，其中最典型的是子宫蓄脓。2023年的综述指出，子宫蓄脓是</w:t>
+        <w:t>对于雌性犬猫而言，手术绝育在预防某些生殖系统疾病方面具有</w:t>
+      </w:r>
+      <w:r>
+        <w:rPr>
+          <w:rFonts w:hint="eastAsia"/>
+        </w:rPr>
+        <w:t>显著</w:t>
+      </w:r>
+      <w:r>
+        <w:t>优势，</w:t>
+      </w:r>
+      <w:r>
+        <w:rPr>
+          <w:rFonts w:hint="eastAsia"/>
+        </w:rPr>
+        <w:t>而其中</w:t>
+      </w:r>
+      <w:r>
+        <w:t>最典型的</w:t>
+      </w:r>
+      <w:r>
+        <w:rPr>
+          <w:rFonts w:hint="eastAsia"/>
+        </w:rPr>
+        <w:t>疾病</w:t>
+      </w:r>
+      <w:r>
+        <w:t>是子宫蓄脓。2023年的</w:t>
+      </w:r>
+      <w:r>
+        <w:rPr>
+          <w:rFonts w:hint="eastAsia"/>
+        </w:rPr>
+        <w:t>一项</w:t>
+      </w:r>
+      <w:r>
+        <w:t>综述指出，子宫蓄脓是</w:t>
       </w:r>
       <w:r>
         <w:rPr>
@@ -638,7 +773,19 @@
         <w:t>患</w:t>
       </w:r>
       <w:r>
-        <w:t>疾病，而卵巢子宫切除术是最安全、最有效的治疗方法，因为它能够直接去除感染来源并防止复发</w:t>
+        <w:t>疾病，而卵巢子宫切除术</w:t>
+      </w:r>
+      <w:r>
+        <w:t>能够直接去除感染来源并防止复发</w:t>
+      </w:r>
+      <w:r>
+        <w:rPr>
+          <w:rFonts w:hint="eastAsia"/>
+        </w:rPr>
+        <w:t>，</w:t>
+      </w:r>
+      <w:r>
+        <w:t>是最安全、最有效的治疗方法</w:t>
       </w:r>
       <w:r>
         <w:rPr>
@@ -650,18 +797,12 @@
         <w:rPr>
           <w:vertAlign w:val="superscript"/>
         </w:rPr>
-        <w:instrText xml:space="preserve"> REF _Ref228003442 \r \h </w:instrText>
-      </w:r>
-      <w:r>
-        <w:rPr>
-          <w:vertAlign w:val="superscript"/>
-        </w:rPr>
-      </w:r>
-      <w:r>
-        <w:rPr>
-          <w:vertAlign w:val="superscript"/>
-        </w:rPr>
-        <w:instrText xml:space="preserve"> \* MERGEFORMAT </w:instrText>
+        <w:instrText xml:space="preserve"> REF _Ref228545722 \r \h  \* MERGEFORMAT </w:instrText>
+      </w:r>
+      <w:r>
+        <w:rPr>
+          <w:vertAlign w:val="superscript"/>
+        </w:rPr>
       </w:r>
       <w:r>
         <w:rPr>
@@ -731,7 +872,7 @@
         <w:rPr>
           <w:rFonts w:hint="eastAsia"/>
         </w:rPr>
-        <w:t>，</w:t>
+        <w:t>。</w:t>
       </w:r>
       <w:r>
         <w:t>WSAVA指南</w:t>
@@ -755,18 +896,12 @@
         <w:rPr>
           <w:vertAlign w:val="superscript"/>
         </w:rPr>
-        <w:instrText xml:space="preserve"> REF _Ref228003341 \r \h </w:instrText>
-      </w:r>
-      <w:r>
-        <w:rPr>
-          <w:vertAlign w:val="superscript"/>
-        </w:rPr>
-      </w:r>
-      <w:r>
-        <w:rPr>
-          <w:vertAlign w:val="superscript"/>
-        </w:rPr>
-        <w:instrText xml:space="preserve"> \* MERGEFORMAT </w:instrText>
+        <w:instrText xml:space="preserve"> REF _Ref228545611 \r \h  \* MERGEFORMAT </w:instrText>
+      </w:r>
+      <w:r>
+        <w:rPr>
+          <w:vertAlign w:val="superscript"/>
+        </w:rPr>
       </w:r>
       <w:r>
         <w:rPr>
@@ -908,10 +1043,16 @@
         <w:rPr>
           <w:rFonts w:hint="eastAsia"/>
         </w:rPr>
-        <w:t>不能被简单概括为</w:t>
-      </w:r>
-      <w:r>
-        <w:t xml:space="preserve">“完全无风险”。 </w:t>
+        <w:t>不能被简单</w:t>
+      </w:r>
+      <w:r>
+        <w:rPr>
+          <w:rFonts w:hint="eastAsia"/>
+        </w:rPr>
+        <w:t>等同于</w:t>
+      </w:r>
+      <w:r>
+        <w:t>“完全无风险”。</w:t>
       </w:r>
     </w:p>
     <w:p>
@@ -945,7 +1086,11 @@
         <w:t>，尤其是对于猫</w:t>
       </w:r>
       <w:r>
-        <w:t>。关于绝育猫肥胖风险的综述指出，绝育后食物摄入增加是体重上升的重要因素，而绝育本身已被流行病学研究视为猫肥胖的重要危险因素之一</w:t>
+        <w:t>。关于绝育猫肥胖风险的综述指出，绝育后食物摄入增加是体重上升的重要因素，而绝育本身已被流行病学研究视</w:t>
+      </w:r>
+      <w:r>
+        <w:lastRenderedPageBreak/>
+        <w:t>为猫肥胖的重要危险因素之一</w:t>
       </w:r>
       <w:r>
         <w:rPr>
@@ -957,18 +1102,12 @@
         <w:rPr>
           <w:vertAlign w:val="superscript"/>
         </w:rPr>
-        <w:instrText xml:space="preserve"> REF _Ref228003500 \r \h </w:instrText>
-      </w:r>
-      <w:r>
-        <w:rPr>
-          <w:vertAlign w:val="superscript"/>
-        </w:rPr>
-      </w:r>
-      <w:r>
-        <w:rPr>
-          <w:vertAlign w:val="superscript"/>
-        </w:rPr>
-        <w:instrText xml:space="preserve"> \* MERGEFORMAT </w:instrText>
+        <w:instrText xml:space="preserve"> REF _Ref228545751 \r \h  \* MERGEFORMAT </w:instrText>
+      </w:r>
+      <w:r>
+        <w:rPr>
+          <w:vertAlign w:val="superscript"/>
+        </w:rPr>
       </w:r>
       <w:r>
         <w:rPr>
@@ -999,7 +1138,6 @@
         <w:ind w:firstLineChars="200" w:firstLine="480"/>
       </w:pPr>
       <w:r>
-        <w:lastRenderedPageBreak/>
         <w:t>对于雌犬而言，尿失禁</w:t>
       </w:r>
       <w:r>
@@ -1033,7 +1171,19 @@
         <w:rPr>
           <w:rFonts w:hint="eastAsia"/>
         </w:rPr>
-        <w:t>尤其对于大型犬猫</w:t>
+        <w:t>尤其</w:t>
+      </w:r>
+      <w:r>
+        <w:rPr>
+          <w:rFonts w:hint="eastAsia"/>
+        </w:rPr>
+        <w:t>是</w:t>
+      </w:r>
+      <w:r>
+        <w:rPr>
+          <w:rFonts w:hint="eastAsia"/>
+        </w:rPr>
+        <w:t>对于大型犬猫</w:t>
       </w:r>
       <w:r>
         <w:rPr>
@@ -1045,18 +1195,12 @@
         <w:rPr>
           <w:vertAlign w:val="superscript"/>
         </w:rPr>
-        <w:instrText xml:space="preserve"> REF _Ref228003341 \r \h </w:instrText>
-      </w:r>
-      <w:r>
-        <w:rPr>
-          <w:vertAlign w:val="superscript"/>
-        </w:rPr>
-      </w:r>
-      <w:r>
-        <w:rPr>
-          <w:vertAlign w:val="superscript"/>
-        </w:rPr>
-        <w:instrText xml:space="preserve"> \* MERGEFORMAT </w:instrText>
+        <w:instrText xml:space="preserve"> REF _Ref228545611 \r \h  \* MERGEFORMAT </w:instrText>
+      </w:r>
+      <w:r>
+        <w:rPr>
+          <w:vertAlign w:val="superscript"/>
+        </w:rPr>
       </w:r>
       <w:r>
         <w:rPr>
@@ -1087,7 +1231,16 @@
         <w:ind w:firstLineChars="200" w:firstLine="480"/>
       </w:pPr>
       <w:r>
-        <w:t>此外，手术绝育在某些常被宣传的健康收益方面，证据并没有那么绝对。</w:t>
+        <w:t>此外，手术绝育在某些常被宣传的健康收益方面，证据</w:t>
+      </w:r>
+      <w:r>
+        <w:rPr>
+          <w:rFonts w:hint="eastAsia"/>
+        </w:rPr>
+        <w:t>提供</w:t>
+      </w:r>
+      <w:r>
+        <w:t>并没有那么绝对。</w:t>
       </w:r>
       <w:r>
         <w:rPr>
@@ -1117,18 +1270,12 @@
         <w:rPr>
           <w:vertAlign w:val="superscript"/>
         </w:rPr>
-        <w:instrText xml:space="preserve"> REF _Ref228003549 \r \h </w:instrText>
-      </w:r>
-      <w:r>
-        <w:rPr>
-          <w:vertAlign w:val="superscript"/>
-        </w:rPr>
-      </w:r>
-      <w:r>
-        <w:rPr>
-          <w:vertAlign w:val="superscript"/>
-        </w:rPr>
-        <w:instrText xml:space="preserve"> \* MERGEFORMAT </w:instrText>
+        <w:instrText xml:space="preserve"> REF _Ref228545771 \r \h  \* MERGEFORMAT </w:instrText>
+      </w:r>
+      <w:r>
+        <w:rPr>
+          <w:vertAlign w:val="superscript"/>
+        </w:rPr>
       </w:r>
       <w:r>
         <w:rPr>
@@ -1255,18 +1402,12 @@
         <w:rPr>
           <w:vertAlign w:val="superscript"/>
         </w:rPr>
-        <w:instrText xml:space="preserve"> REF _Ref228003341 \r \h </w:instrText>
-      </w:r>
-      <w:r>
-        <w:rPr>
-          <w:vertAlign w:val="superscript"/>
-        </w:rPr>
-      </w:r>
-      <w:r>
-        <w:rPr>
-          <w:vertAlign w:val="superscript"/>
-        </w:rPr>
-        <w:instrText xml:space="preserve"> \* MERGEFORMAT </w:instrText>
+        <w:instrText xml:space="preserve"> REF _Ref228545611 \r \h  \* MERGEFORMAT </w:instrText>
+      </w:r>
+      <w:r>
+        <w:rPr>
+          <w:vertAlign w:val="superscript"/>
+        </w:rPr>
       </w:r>
       <w:r>
         <w:rPr>
@@ -1306,7 +1447,15 @@
         <w:t>另一个突出</w:t>
       </w:r>
       <w:r>
-        <w:t>优点是部分方法具有可逆性。以GnRH激动剂植入剂 deslorelin为代表的药物通过持续作用于</w:t>
+        <w:t xml:space="preserve">优点是部分方法具有可逆性。以GnRH激动剂植入剂 </w:t>
+      </w:r>
+      <w:proofErr w:type="spellStart"/>
+      <w:r>
+        <w:t>deslorelin</w:t>
+      </w:r>
+      <w:proofErr w:type="spellEnd"/>
+      <w:r>
+        <w:t>为代表的药物通过持续作用于</w:t>
       </w:r>
       <w:r>
         <w:rPr>
@@ -1324,16 +1473,18 @@
         <w:t>”调控</w:t>
       </w:r>
       <w:r>
-        <w:t>轴抑制性激素分泌和配子发生；在药效消退后，动物往往能够逐步恢复生殖功能。关于猫的综述指出，在已达性成熟的猫中，4.7 mg</w:t>
-      </w:r>
-      <w:r>
-        <w:rPr>
-          <w:rFonts w:hint="eastAsia"/>
-        </w:rPr>
-        <w:t>缓释deslorelin</w:t>
-      </w:r>
-      <w:r>
-        <w:t>植入剂对性类固醇分泌的抑制平均可持续约 20 个月，范围大约为15–25个月</w:t>
+        <w:t>轴抑制性激素分泌和配子发生；在药效消退后，动物往往能够逐步恢复生殖功能。</w:t>
+      </w:r>
+      <w:r>
+        <w:t>关于猫的综述指出，在已达性成熟的猫中，4.7 mg缓释</w:t>
+      </w:r>
+      <w:proofErr w:type="spellStart"/>
+      <w:r>
+        <w:t>deslorelin</w:t>
+      </w:r>
+      <w:proofErr w:type="spellEnd"/>
+      <w:r>
+        <w:t>植入剂对性类固醇分泌的抑制时间存在性别差异：在雄猫中平均可持续约20个月（范围约15–25个月），而在雌猫中则平均长达约24个月（范围约16–37个月）</w:t>
       </w:r>
       <w:r>
         <w:rPr>
@@ -1345,18 +1496,12 @@
         <w:rPr>
           <w:vertAlign w:val="superscript"/>
         </w:rPr>
-        <w:instrText xml:space="preserve"> REF _Ref228003584 \r \h </w:instrText>
-      </w:r>
-      <w:r>
-        <w:rPr>
-          <w:vertAlign w:val="superscript"/>
-        </w:rPr>
-      </w:r>
-      <w:r>
-        <w:rPr>
-          <w:vertAlign w:val="superscript"/>
-        </w:rPr>
-        <w:instrText xml:space="preserve"> \* MERGEFORMAT </w:instrText>
+        <w:instrText xml:space="preserve"> REF _Ref228545794 \r \h  \* MERGEFORMAT </w:instrText>
+      </w:r>
+      <w:r>
+        <w:rPr>
+          <w:vertAlign w:val="superscript"/>
+        </w:rPr>
       </w:r>
       <w:r>
         <w:rPr>
@@ -1396,7 +1541,15 @@
         <w:t>这一观点</w:t>
       </w:r>
       <w:r>
-        <w:t>。研究显示，4.7 mg deslorelin 植入剂可在完整雄猫中诱导约 1 年的不育效果，平均持续时间约为372±5天，同时还能降低雄性激素相关表现</w:t>
+        <w:t xml:space="preserve">。研究显示，4.7 mg </w:t>
+      </w:r>
+      <w:proofErr w:type="spellStart"/>
+      <w:r>
+        <w:t>deslorelin</w:t>
+      </w:r>
+      <w:proofErr w:type="spellEnd"/>
+      <w:r>
+        <w:t xml:space="preserve"> 植入剂可在完整雄猫中诱导约 1 年的不育效果，平均持续时间约为372±5天，同时还能降低雄性激素相关表现</w:t>
       </w:r>
       <w:r>
         <w:rPr>
@@ -1408,18 +1561,12 @@
         <w:rPr>
           <w:vertAlign w:val="superscript"/>
         </w:rPr>
-        <w:instrText xml:space="preserve"> REF _Ref228003602 \r \h </w:instrText>
-      </w:r>
-      <w:r>
-        <w:rPr>
-          <w:vertAlign w:val="superscript"/>
-        </w:rPr>
-      </w:r>
-      <w:r>
-        <w:rPr>
-          <w:vertAlign w:val="superscript"/>
-        </w:rPr>
-        <w:instrText xml:space="preserve"> \* MERGEFORMAT </w:instrText>
+        <w:instrText xml:space="preserve"> REF _Ref228545807 \r \h </w:instrText>
+      </w:r>
+      <w:r>
+        <w:rPr>
+          <w:vertAlign w:val="superscript"/>
+        </w:rPr>
       </w:r>
       <w:r>
         <w:rPr>
@@ -1477,7 +1624,15 @@
         <w:t>调整</w:t>
       </w:r>
       <w:r>
-        <w:t>。2020 年关于 GnRH激动剂植入剂在雄犬中的综述提出，deslorelin可以被视为外科绝育的一种替代或补充选择，尤其适用于需要“可逆去势效果”的场景</w:t>
+        <w:t>。2020 年关于 GnRH激动剂植入剂在雄犬中的综述提出，</w:t>
+      </w:r>
+      <w:proofErr w:type="spellStart"/>
+      <w:r>
+        <w:t>deslorelin</w:t>
+      </w:r>
+      <w:proofErr w:type="spellEnd"/>
+      <w:r>
+        <w:t>可以被视为外科绝育的一种替代或补充选择，尤其适用于需要“可逆去势效果”的场景</w:t>
       </w:r>
       <w:r>
         <w:rPr>
@@ -1489,18 +1644,12 @@
         <w:rPr>
           <w:vertAlign w:val="superscript"/>
         </w:rPr>
-        <w:instrText xml:space="preserve"> REF _Ref228003617 \r \h </w:instrText>
-      </w:r>
-      <w:r>
-        <w:rPr>
-          <w:vertAlign w:val="superscript"/>
-        </w:rPr>
-      </w:r>
-      <w:r>
-        <w:rPr>
-          <w:vertAlign w:val="superscript"/>
-        </w:rPr>
-        <w:instrText xml:space="preserve"> \* MERGEFORMAT </w:instrText>
+        <w:instrText xml:space="preserve"> REF _Ref228545810 \r \h  \* MERGEFORMAT </w:instrText>
+      </w:r>
+      <w:r>
+        <w:rPr>
+          <w:vertAlign w:val="superscript"/>
+        </w:rPr>
       </w:r>
       <w:r>
         <w:rPr>
@@ -1546,6 +1695,7 @@
           <w:sz w:val="24"/>
           <w:szCs w:val="24"/>
         </w:rPr>
+        <w:lastRenderedPageBreak/>
         <w:t>2</w:t>
       </w:r>
       <w:r>
@@ -1576,11 +1726,25 @@
         <w:ind w:firstLineChars="200" w:firstLine="480"/>
       </w:pPr>
       <w:r>
-        <w:t>尽管药物绝育具有一定吸引力，但其局限性同样十分明显。首先，药物绝育最大的缺点之一是效果的稳定性和一致性通常不如手术绝育。手术绝育一旦完成，往</w:t>
-      </w:r>
-      <w:r>
-        <w:lastRenderedPageBreak/>
-        <w:t>往即可实现长期而稳定的繁殖阻断；而药物绝育的效果则会受到药物</w:t>
+        <w:t>尽管药物绝育具有一定吸引力，但其局限性同样</w:t>
+      </w:r>
+      <w:r>
+        <w:rPr>
+          <w:rFonts w:hint="eastAsia"/>
+        </w:rPr>
+        <w:t>也</w:t>
+      </w:r>
+      <w:r>
+        <w:t>十分明显。药物绝育</w:t>
+      </w:r>
+      <w:r>
+        <w:rPr>
+          <w:rFonts w:hint="eastAsia"/>
+        </w:rPr>
+        <w:t>首先要面临的一项不足就是</w:t>
+      </w:r>
+      <w:r>
+        <w:t>效果的稳定性和一致性通常不如手术绝育。手术绝育一旦完成，往往即可实现长期而稳定的繁殖阻断；而药物绝育的效果则会受到药物</w:t>
       </w:r>
       <w:r>
         <w:rPr>
@@ -1610,18 +1774,12 @@
         <w:rPr>
           <w:vertAlign w:val="superscript"/>
         </w:rPr>
-        <w:instrText xml:space="preserve"> REF _Ref228003630 \r \h </w:instrText>
-      </w:r>
-      <w:r>
-        <w:rPr>
-          <w:vertAlign w:val="superscript"/>
-        </w:rPr>
-      </w:r>
-      <w:r>
-        <w:rPr>
-          <w:vertAlign w:val="superscript"/>
-        </w:rPr>
-        <w:instrText xml:space="preserve"> \* MERGEFORMAT </w:instrText>
+        <w:instrText xml:space="preserve"> REF _Ref228545817 \r \h  \* MERGEFORMAT </w:instrText>
+      </w:r>
+      <w:r>
+        <w:rPr>
+          <w:vertAlign w:val="superscript"/>
+        </w:rPr>
       </w:r>
       <w:r>
         <w:rPr>
@@ -1658,7 +1816,7 @@
         <w:rPr>
           <w:rFonts w:hint="eastAsia"/>
         </w:rPr>
-        <w:t>另外</w:t>
+        <w:t>此外</w:t>
       </w:r>
       <w:r>
         <w:t>，副作用问题是药物</w:t>
@@ -1682,18 +1840,12 @@
         <w:rPr>
           <w:vertAlign w:val="superscript"/>
         </w:rPr>
-        <w:instrText xml:space="preserve"> REF _Ref228003644 \r \h </w:instrText>
-      </w:r>
-      <w:r>
-        <w:rPr>
-          <w:vertAlign w:val="superscript"/>
-        </w:rPr>
-      </w:r>
-      <w:r>
-        <w:rPr>
-          <w:vertAlign w:val="superscript"/>
-        </w:rPr>
-        <w:instrText xml:space="preserve"> \* MERGEFORMAT </w:instrText>
+        <w:instrText xml:space="preserve"> REF _Ref228545823 \r \h </w:instrText>
+      </w:r>
+      <w:r>
+        <w:rPr>
+          <w:vertAlign w:val="superscript"/>
+        </w:rPr>
       </w:r>
       <w:r>
         <w:rPr>
@@ -1706,47 +1858,6 @@
           <w:vertAlign w:val="superscript"/>
         </w:rPr>
         <w:t>[10]</w:t>
-      </w:r>
-      <w:r>
-        <w:rPr>
-          <w:vertAlign w:val="superscript"/>
-        </w:rPr>
-        <w:fldChar w:fldCharType="end"/>
-      </w:r>
-      <w:r>
-        <w:rPr>
-          <w:vertAlign w:val="superscript"/>
-        </w:rPr>
-        <w:fldChar w:fldCharType="begin"/>
-      </w:r>
-      <w:r>
-        <w:rPr>
-          <w:vertAlign w:val="superscript"/>
-        </w:rPr>
-        <w:instrText xml:space="preserve"> REF _Ref228003665 \r \h </w:instrText>
-      </w:r>
-      <w:r>
-        <w:rPr>
-          <w:vertAlign w:val="superscript"/>
-        </w:rPr>
-      </w:r>
-      <w:r>
-        <w:rPr>
-          <w:vertAlign w:val="superscript"/>
-        </w:rPr>
-        <w:instrText xml:space="preserve"> \* MERGEFORMAT </w:instrText>
-      </w:r>
-      <w:r>
-        <w:rPr>
-          <w:vertAlign w:val="superscript"/>
-        </w:rPr>
-        <w:fldChar w:fldCharType="separate"/>
-      </w:r>
-      <w:r>
-        <w:rPr>
-          <w:vertAlign w:val="superscript"/>
-        </w:rPr>
-        <w:t>[11]</w:t>
       </w:r>
       <w:r>
         <w:rPr>
@@ -1771,7 +1882,15 @@
         <w:t>同时，</w:t>
       </w:r>
       <w:r>
-        <w:t>部分药物性方法还存在起效延迟或反跳现象。例如 GnRH 激动剂类药物在开始使用后，可能先出现短暂的促性腺激素释放增强，随后才进入抑制阶段。在犬的相关研究中，deslorelin 起效并非立即发生，而是需要一定时间达到性腺轴下调状态。</w:t>
+        <w:t>部分药物性方法还存在起效延迟或反跳现象。例如 GnRH 激动剂类药物在开始使用后，可能先出现短暂的促性腺激素释放增强，随后才进入抑制阶段。在犬的相关研究中，</w:t>
+      </w:r>
+      <w:proofErr w:type="spellStart"/>
+      <w:r>
+        <w:t>deslorelin</w:t>
+      </w:r>
+      <w:proofErr w:type="spellEnd"/>
+      <w:r>
+        <w:t xml:space="preserve"> 起效并非立即发生，而是需要一定时间达到性腺轴下调状态。</w:t>
       </w:r>
       <w:r>
         <w:rPr>
@@ -1783,18 +1902,12 @@
         <w:rPr>
           <w:vertAlign w:val="superscript"/>
         </w:rPr>
-        <w:instrText xml:space="preserve"> REF _Ref228003686 \r \h </w:instrText>
-      </w:r>
-      <w:r>
-        <w:rPr>
-          <w:vertAlign w:val="superscript"/>
-        </w:rPr>
-      </w:r>
-      <w:r>
-        <w:rPr>
-          <w:vertAlign w:val="superscript"/>
-        </w:rPr>
-        <w:instrText xml:space="preserve"> \* MERGEFORMAT </w:instrText>
+        <w:instrText xml:space="preserve"> REF _Ref228545828 \r \h </w:instrText>
+      </w:r>
+      <w:r>
+        <w:rPr>
+          <w:vertAlign w:val="superscript"/>
+        </w:rPr>
       </w:r>
       <w:r>
         <w:rPr>
@@ -1806,7 +1919,7 @@
         <w:rPr>
           <w:vertAlign w:val="superscript"/>
         </w:rPr>
-        <w:t>[12]</w:t>
+        <w:t>[11]</w:t>
       </w:r>
       <w:r>
         <w:rPr>
@@ -2054,12 +2167,207 @@
     <w:p>
       <w:pPr>
         <w:pStyle w:val="a7"/>
-        <w:widowControl/>
         <w:numPr>
           <w:ilvl w:val="0"/>
-          <w:numId w:val="1"/>
+          <w:numId w:val="2"/>
         </w:numPr>
-        <w:spacing w:line="360" w:lineRule="exact"/>
+        <w:ind w:firstLineChars="0"/>
+        <w:rPr>
+          <w:rFonts w:ascii="Times New Roman" w:eastAsia="宋体" w:hAnsi="Times New Roman" w:cs="Times New Roman"/>
+          <w:kern w:val="0"/>
+          <w:szCs w:val="21"/>
+        </w:rPr>
+      </w:pPr>
+      <w:bookmarkStart w:id="0" w:name="_Ref228545611"/>
+      <w:proofErr w:type="spellStart"/>
+      <w:r>
+        <w:rPr>
+          <w:rFonts w:ascii="Times New Roman" w:eastAsia="宋体" w:hAnsi="Times New Roman" w:cs="Times New Roman"/>
+          <w:kern w:val="0"/>
+          <w:szCs w:val="21"/>
+        </w:rPr>
+        <w:t>Romagnoli</w:t>
+      </w:r>
+      <w:proofErr w:type="spellEnd"/>
+      <w:r>
+        <w:rPr>
+          <w:rFonts w:ascii="Times New Roman" w:eastAsia="宋体" w:hAnsi="Times New Roman" w:cs="Times New Roman"/>
+          <w:kern w:val="0"/>
+          <w:szCs w:val="21"/>
+        </w:rPr>
+        <w:t xml:space="preserve"> S, </w:t>
+      </w:r>
+      <w:proofErr w:type="spellStart"/>
+      <w:r>
+        <w:rPr>
+          <w:rFonts w:ascii="Times New Roman" w:eastAsia="宋体" w:hAnsi="Times New Roman" w:cs="Times New Roman"/>
+          <w:kern w:val="0"/>
+          <w:szCs w:val="21"/>
+        </w:rPr>
+        <w:t>Krekeler</w:t>
+      </w:r>
+      <w:proofErr w:type="spellEnd"/>
+      <w:r>
+        <w:rPr>
+          <w:rFonts w:ascii="Times New Roman" w:eastAsia="宋体" w:hAnsi="Times New Roman" w:cs="Times New Roman"/>
+          <w:kern w:val="0"/>
+          <w:szCs w:val="21"/>
+        </w:rPr>
+        <w:t xml:space="preserve"> N, de Cramer K, et al. WSAVA guidelines for the control of reproduction in dogs and cats[J]. Journal of Small Animal Practice, 2024, 65(7): 424-559.</w:t>
+      </w:r>
+      <w:bookmarkEnd w:id="0"/>
+    </w:p>
+    <w:p>
+      <w:pPr>
+        <w:pStyle w:val="a7"/>
+        <w:numPr>
+          <w:ilvl w:val="0"/>
+          <w:numId w:val="2"/>
+        </w:numPr>
+        <w:ind w:firstLineChars="0"/>
+        <w:rPr>
+          <w:rFonts w:ascii="Times New Roman" w:eastAsia="宋体" w:hAnsi="Times New Roman" w:cs="Times New Roman"/>
+          <w:kern w:val="0"/>
+          <w:szCs w:val="21"/>
+        </w:rPr>
+      </w:pPr>
+      <w:bookmarkStart w:id="1" w:name="_Ref228545688"/>
+      <w:r>
+        <w:rPr>
+          <w:rFonts w:ascii="Times New Roman" w:eastAsia="宋体" w:hAnsi="Times New Roman" w:cs="Times New Roman"/>
+          <w:kern w:val="0"/>
+          <w:szCs w:val="21"/>
+        </w:rPr>
+        <w:t>Grubb T, Sager J, Gaynor JS, et al. 2020 AAHA Anesthesia and Monitoring Guidelines for Dogs and Cats[J]. Journal of the American Animal Hospital Association, 2020, 56(2): 59-82.</w:t>
+      </w:r>
+      <w:bookmarkEnd w:id="1"/>
+    </w:p>
+    <w:p>
+      <w:pPr>
+        <w:pStyle w:val="a7"/>
+        <w:numPr>
+          <w:ilvl w:val="0"/>
+          <w:numId w:val="2"/>
+        </w:numPr>
+        <w:ind w:firstLineChars="0"/>
+        <w:rPr>
+          <w:rFonts w:ascii="Times New Roman" w:eastAsia="宋体" w:hAnsi="Times New Roman" w:cs="Times New Roman"/>
+          <w:kern w:val="0"/>
+          <w:szCs w:val="21"/>
+        </w:rPr>
+      </w:pPr>
+      <w:bookmarkStart w:id="2" w:name="_Ref228545722"/>
+      <w:r>
+        <w:rPr>
+          <w:rFonts w:ascii="Times New Roman" w:eastAsia="宋体" w:hAnsi="Times New Roman" w:cs="Times New Roman"/>
+          <w:kern w:val="0"/>
+          <w:szCs w:val="21"/>
+        </w:rPr>
+        <w:t>Hagman R. Pyometra in Small Animals 3.0[J]. Veterinary Clinics of North America: Small Animal Practice, 2023, 53(5): 1223-1254.</w:t>
+      </w:r>
+      <w:bookmarkEnd w:id="2"/>
+      <w:r>
+        <w:rPr>
+          <w:rFonts w:ascii="Times New Roman" w:eastAsia="宋体" w:hAnsi="Times New Roman" w:cs="Times New Roman"/>
+          <w:kern w:val="0"/>
+          <w:szCs w:val="21"/>
+        </w:rPr>
+        <w:t xml:space="preserve"> </w:t>
+      </w:r>
+    </w:p>
+    <w:p>
+      <w:pPr>
+        <w:pStyle w:val="a7"/>
+        <w:numPr>
+          <w:ilvl w:val="0"/>
+          <w:numId w:val="2"/>
+        </w:numPr>
+        <w:ind w:firstLineChars="0"/>
+        <w:rPr>
+          <w:rFonts w:ascii="Times New Roman" w:eastAsia="宋体" w:hAnsi="Times New Roman" w:cs="Times New Roman"/>
+          <w:kern w:val="0"/>
+          <w:szCs w:val="21"/>
+        </w:rPr>
+      </w:pPr>
+      <w:bookmarkStart w:id="3" w:name="_Ref228545751"/>
+      <w:r>
+        <w:rPr>
+          <w:rFonts w:ascii="Times New Roman" w:eastAsia="宋体" w:hAnsi="Times New Roman" w:cs="Times New Roman"/>
+          <w:kern w:val="0"/>
+          <w:szCs w:val="21"/>
+        </w:rPr>
+        <w:t>Larsen J A. Risk of obesity in the neutered cat[J]. Journal of Feline Medicine and Surgery, 2017, 19(7): 779-783.</w:t>
+      </w:r>
+      <w:bookmarkEnd w:id="3"/>
+    </w:p>
+    <w:p>
+      <w:pPr>
+        <w:pStyle w:val="a7"/>
+        <w:numPr>
+          <w:ilvl w:val="0"/>
+          <w:numId w:val="2"/>
+        </w:numPr>
+        <w:ind w:firstLineChars="0"/>
+        <w:rPr>
+          <w:rFonts w:ascii="Times New Roman" w:eastAsia="宋体" w:hAnsi="Times New Roman" w:cs="Times New Roman"/>
+          <w:kern w:val="0"/>
+          <w:szCs w:val="21"/>
+        </w:rPr>
+      </w:pPr>
+      <w:bookmarkStart w:id="4" w:name="_Ref228545771"/>
+      <w:r>
+        <w:rPr>
+          <w:rFonts w:ascii="Times New Roman" w:eastAsia="宋体" w:hAnsi="Times New Roman" w:cs="Times New Roman"/>
+          <w:kern w:val="0"/>
+          <w:szCs w:val="21"/>
+        </w:rPr>
+        <w:t xml:space="preserve">Beauvais W, Cardwell J M, </w:t>
+      </w:r>
+      <w:proofErr w:type="spellStart"/>
+      <w:r>
+        <w:rPr>
+          <w:rFonts w:ascii="Times New Roman" w:eastAsia="宋体" w:hAnsi="Times New Roman" w:cs="Times New Roman"/>
+          <w:kern w:val="0"/>
+          <w:szCs w:val="21"/>
+        </w:rPr>
+        <w:t>Brodbelt</w:t>
+      </w:r>
+      <w:proofErr w:type="spellEnd"/>
+      <w:r>
+        <w:rPr>
+          <w:rFonts w:ascii="Times New Roman" w:eastAsia="宋体" w:hAnsi="Times New Roman" w:cs="Times New Roman"/>
+          <w:kern w:val="0"/>
+          <w:szCs w:val="21"/>
+        </w:rPr>
+        <w:t xml:space="preserve"> D C. The effect of neutering on the risk of mammary </w:t>
+      </w:r>
+      <w:proofErr w:type="spellStart"/>
+      <w:r>
+        <w:rPr>
+          <w:rFonts w:ascii="Times New Roman" w:eastAsia="宋体" w:hAnsi="Times New Roman" w:cs="Times New Roman"/>
+          <w:kern w:val="0"/>
+          <w:szCs w:val="21"/>
+        </w:rPr>
+        <w:t>tumours</w:t>
+      </w:r>
+      <w:proofErr w:type="spellEnd"/>
+      <w:r>
+        <w:rPr>
+          <w:rFonts w:ascii="Times New Roman" w:eastAsia="宋体" w:hAnsi="Times New Roman" w:cs="Times New Roman"/>
+          <w:kern w:val="0"/>
+          <w:szCs w:val="21"/>
+        </w:rPr>
+        <w:t xml:space="preserve"> in dogs: a systematic review[J]. Journal of Small Animal Practice, 2012, 53(6): 314-322.</w:t>
+      </w:r>
+      <w:bookmarkEnd w:id="4"/>
+    </w:p>
+    <w:p>
+      <w:pPr>
+        <w:pStyle w:val="a7"/>
+        <w:numPr>
+          <w:ilvl w:val="0"/>
+          <w:numId w:val="2"/>
+        </w:numPr>
         <w:ind w:firstLineChars="0"/>
         <w:jc w:val="left"/>
         <w:rPr>
@@ -2068,332 +2376,326 @@
           <w:szCs w:val="21"/>
         </w:rPr>
       </w:pPr>
-      <w:bookmarkStart w:id="0" w:name="_Ref228003341"/>
-      <w:r>
-        <w:rPr>
-          <w:rFonts w:ascii="Times New Roman" w:eastAsia="宋体" w:hAnsi="Times New Roman" w:cs="Times New Roman"/>
-          <w:kern w:val="0"/>
-          <w:szCs w:val="21"/>
-        </w:rPr>
-        <w:t>Romagnoli S, Krekeler N, de Cramer K, et al. WSAVA guidelines for the control of reproduction in dogs and cats[J]. Journal of Small Animal Practice, 2024, 65(7): 424-559.</w:t>
-      </w:r>
-      <w:bookmarkEnd w:id="0"/>
+      <w:bookmarkStart w:id="5" w:name="_Ref228545794"/>
+      <w:r>
+        <w:rPr>
+          <w:rFonts w:ascii="Times New Roman" w:eastAsia="宋体" w:hAnsi="Times New Roman" w:cs="Times New Roman"/>
+          <w:kern w:val="0"/>
+          <w:szCs w:val="21"/>
+        </w:rPr>
+        <w:t xml:space="preserve">Fontaine C. Long-term contraception in a small implant: A review of </w:t>
+      </w:r>
+      <w:proofErr w:type="spellStart"/>
+      <w:r>
+        <w:rPr>
+          <w:rFonts w:ascii="Times New Roman" w:eastAsia="宋体" w:hAnsi="Times New Roman" w:cs="Times New Roman"/>
+          <w:kern w:val="0"/>
+          <w:szCs w:val="21"/>
+        </w:rPr>
+        <w:t>Suprelorin</w:t>
+      </w:r>
+      <w:proofErr w:type="spellEnd"/>
+      <w:r>
+        <w:rPr>
+          <w:rFonts w:ascii="Times New Roman" w:eastAsia="宋体" w:hAnsi="Times New Roman" w:cs="Times New Roman"/>
+          <w:kern w:val="0"/>
+          <w:szCs w:val="21"/>
+        </w:rPr>
+        <w:t xml:space="preserve"> (</w:t>
+      </w:r>
+      <w:proofErr w:type="spellStart"/>
+      <w:r>
+        <w:rPr>
+          <w:rFonts w:ascii="Times New Roman" w:eastAsia="宋体" w:hAnsi="Times New Roman" w:cs="Times New Roman"/>
+          <w:kern w:val="0"/>
+          <w:szCs w:val="21"/>
+        </w:rPr>
+        <w:t>deslorelin</w:t>
+      </w:r>
+      <w:proofErr w:type="spellEnd"/>
+      <w:r>
+        <w:rPr>
+          <w:rFonts w:ascii="Times New Roman" w:eastAsia="宋体" w:hAnsi="Times New Roman" w:cs="Times New Roman"/>
+          <w:kern w:val="0"/>
+          <w:szCs w:val="21"/>
+        </w:rPr>
+        <w:t>) studies in cats [J]. Journal of Feline Medicine and Surgery, 2015, 17(9): 766-771.</w:t>
+      </w:r>
+      <w:bookmarkEnd w:id="5"/>
     </w:p>
     <w:p>
       <w:pPr>
         <w:pStyle w:val="a7"/>
-        <w:widowControl/>
         <w:numPr>
           <w:ilvl w:val="0"/>
-          <w:numId w:val="1"/>
+          <w:numId w:val="2"/>
         </w:numPr>
-        <w:spacing w:line="360" w:lineRule="exact"/>
         <w:ind w:firstLineChars="0"/>
-        <w:jc w:val="left"/>
-        <w:rPr>
-          <w:rFonts w:ascii="Times New Roman" w:eastAsia="宋体" w:hAnsi="Times New Roman" w:cs="Times New Roman"/>
-          <w:kern w:val="0"/>
-          <w:szCs w:val="21"/>
-        </w:rPr>
-      </w:pPr>
-      <w:bookmarkStart w:id="1" w:name="_Ref228003424"/>
-      <w:r>
-        <w:rPr>
-          <w:rFonts w:ascii="Times New Roman" w:eastAsia="宋体" w:hAnsi="Times New Roman" w:cs="Times New Roman"/>
-          <w:kern w:val="0"/>
-          <w:szCs w:val="21"/>
-        </w:rPr>
-        <w:t>Grubb T, Sager J, Gaynor JS, et al. 2020 AAHA Anesthesia and Monitoring Guidelines for Dogs and Cats[J]. Journal of the American Animal Hospital Association, 2020, 56(2): 59-82.</w:t>
-      </w:r>
-      <w:bookmarkEnd w:id="1"/>
+        <w:rPr>
+          <w:rFonts w:ascii="Times New Roman" w:eastAsia="宋体" w:hAnsi="Times New Roman" w:cs="Times New Roman"/>
+          <w:kern w:val="0"/>
+          <w:szCs w:val="21"/>
+        </w:rPr>
+      </w:pPr>
+      <w:bookmarkStart w:id="6" w:name="_Ref228545807"/>
+      <w:r>
+        <w:rPr>
+          <w:rFonts w:ascii="Times New Roman" w:eastAsia="宋体" w:hAnsi="Times New Roman" w:cs="Times New Roman"/>
+          <w:kern w:val="0"/>
+          <w:szCs w:val="21"/>
+        </w:rPr>
+        <w:t xml:space="preserve">Amaral J, </w:t>
+      </w:r>
+      <w:proofErr w:type="spellStart"/>
+      <w:r>
+        <w:rPr>
+          <w:rFonts w:ascii="Times New Roman" w:eastAsia="宋体" w:hAnsi="Times New Roman" w:cs="Times New Roman"/>
+          <w:kern w:val="0"/>
+          <w:szCs w:val="21"/>
+        </w:rPr>
+        <w:t>Briantais</w:t>
+      </w:r>
+      <w:proofErr w:type="spellEnd"/>
+      <w:r>
+        <w:rPr>
+          <w:rFonts w:ascii="Times New Roman" w:eastAsia="宋体" w:hAnsi="Times New Roman" w:cs="Times New Roman"/>
+          <w:kern w:val="0"/>
+          <w:szCs w:val="21"/>
+        </w:rPr>
+        <w:t xml:space="preserve"> P, Fontaine C, et al. Efficacy and Safety of 4.7 mg </w:t>
+      </w:r>
+      <w:proofErr w:type="spellStart"/>
+      <w:r>
+        <w:rPr>
+          <w:rFonts w:ascii="Times New Roman" w:eastAsia="宋体" w:hAnsi="Times New Roman" w:cs="Times New Roman"/>
+          <w:kern w:val="0"/>
+          <w:szCs w:val="21"/>
+        </w:rPr>
+        <w:t>Deslorelin</w:t>
+      </w:r>
+      <w:proofErr w:type="spellEnd"/>
+      <w:r>
+        <w:rPr>
+          <w:rFonts w:ascii="Times New Roman" w:eastAsia="宋体" w:hAnsi="Times New Roman" w:cs="Times New Roman"/>
+          <w:kern w:val="0"/>
+          <w:szCs w:val="21"/>
+        </w:rPr>
+        <w:t xml:space="preserve"> Acetate Implants as a Neutering Option in Male Cats[J]. Animals, 2023, 13(3): 379.</w:t>
+      </w:r>
+      <w:bookmarkEnd w:id="6"/>
+      <w:r>
+        <w:rPr>
+          <w:rFonts w:ascii="Times New Roman" w:eastAsia="宋体" w:hAnsi="Times New Roman" w:cs="Times New Roman"/>
+          <w:kern w:val="0"/>
+          <w:szCs w:val="21"/>
+        </w:rPr>
+        <w:t xml:space="preserve"> </w:t>
+      </w:r>
     </w:p>
     <w:p>
       <w:pPr>
         <w:pStyle w:val="a7"/>
-        <w:widowControl/>
         <w:numPr>
           <w:ilvl w:val="0"/>
-          <w:numId w:val="1"/>
+          <w:numId w:val="2"/>
         </w:numPr>
-        <w:spacing w:line="360" w:lineRule="exact"/>
         <w:ind w:firstLineChars="0"/>
-        <w:jc w:val="left"/>
-        <w:rPr>
-          <w:rFonts w:ascii="Times New Roman" w:eastAsia="宋体" w:hAnsi="Times New Roman" w:cs="Times New Roman"/>
-          <w:kern w:val="0"/>
-          <w:szCs w:val="21"/>
-        </w:rPr>
-      </w:pPr>
-      <w:bookmarkStart w:id="2" w:name="_Ref228003442"/>
-      <w:r>
-        <w:rPr>
-          <w:rFonts w:ascii="Times New Roman" w:eastAsia="宋体" w:hAnsi="Times New Roman" w:cs="Times New Roman"/>
-          <w:kern w:val="0"/>
-          <w:szCs w:val="21"/>
-        </w:rPr>
-        <w:t>Hagman R. Pyometra in Small Animals 3.0[J]. Veterinary Clinics of North America: Small Animal Practice, 2023, 53(5): 1049-1066.</w:t>
-      </w:r>
-      <w:bookmarkEnd w:id="2"/>
+        <w:rPr>
+          <w:rFonts w:ascii="Times New Roman" w:eastAsia="宋体" w:hAnsi="Times New Roman" w:cs="Times New Roman"/>
+          <w:kern w:val="0"/>
+          <w:szCs w:val="21"/>
+        </w:rPr>
+      </w:pPr>
+      <w:bookmarkStart w:id="7" w:name="_Ref228545810"/>
+      <w:proofErr w:type="spellStart"/>
+      <w:r>
+        <w:rPr>
+          <w:rFonts w:ascii="Times New Roman" w:eastAsia="宋体" w:hAnsi="Times New Roman" w:cs="Times New Roman"/>
+          <w:kern w:val="0"/>
+          <w:szCs w:val="21"/>
+        </w:rPr>
+        <w:t>Driancourt</w:t>
+      </w:r>
+      <w:proofErr w:type="spellEnd"/>
+      <w:r>
+        <w:rPr>
+          <w:rFonts w:ascii="Times New Roman" w:eastAsia="宋体" w:hAnsi="Times New Roman" w:cs="Times New Roman"/>
+          <w:kern w:val="0"/>
+          <w:szCs w:val="21"/>
+        </w:rPr>
+        <w:t xml:space="preserve"> M A, Briggs J R. Gonadotropin-Releasing Hormone (GnRH) Agonist Implants for Male Dog Fertility Suppression: A Review of Mode of Action, Efficacy, Safety, and Uses[J]. Frontiers in Veterinary Science, 2020, 7: 483.</w:t>
+      </w:r>
+      <w:bookmarkEnd w:id="7"/>
+      <w:r>
+        <w:rPr>
+          <w:rFonts w:ascii="Times New Roman" w:eastAsia="宋体" w:hAnsi="Times New Roman" w:cs="Times New Roman"/>
+          <w:kern w:val="0"/>
+          <w:szCs w:val="21"/>
+        </w:rPr>
+        <w:t xml:space="preserve"> </w:t>
+      </w:r>
     </w:p>
     <w:p>
       <w:pPr>
         <w:pStyle w:val="a7"/>
-        <w:widowControl/>
         <w:numPr>
           <w:ilvl w:val="0"/>
-          <w:numId w:val="1"/>
+          <w:numId w:val="2"/>
         </w:numPr>
-        <w:spacing w:line="360" w:lineRule="exact"/>
         <w:ind w:firstLineChars="0"/>
-        <w:jc w:val="left"/>
-        <w:rPr>
-          <w:rFonts w:ascii="Times New Roman" w:eastAsia="宋体" w:hAnsi="Times New Roman" w:cs="Times New Roman"/>
-          <w:kern w:val="0"/>
-          <w:szCs w:val="21"/>
-        </w:rPr>
-      </w:pPr>
-      <w:bookmarkStart w:id="3" w:name="_Ref228003500"/>
-      <w:r>
-        <w:rPr>
-          <w:rFonts w:ascii="Times New Roman" w:eastAsia="宋体" w:hAnsi="Times New Roman" w:cs="Times New Roman"/>
-          <w:kern w:val="0"/>
-          <w:szCs w:val="21"/>
-        </w:rPr>
-        <w:t>Larsen J A. Risk of obesity in the neutered cat[J]. Journal of Feline Medicine and Surgery, 2017, 19(7): 779-783.</w:t>
-      </w:r>
-      <w:bookmarkEnd w:id="3"/>
+        <w:rPr>
+          <w:rFonts w:ascii="Times New Roman" w:eastAsia="宋体" w:hAnsi="Times New Roman" w:cs="Times New Roman"/>
+          <w:kern w:val="0"/>
+          <w:szCs w:val="21"/>
+        </w:rPr>
+      </w:pPr>
+      <w:bookmarkStart w:id="8" w:name="_Ref228545817"/>
+      <w:r>
+        <w:rPr>
+          <w:rFonts w:ascii="Times New Roman" w:eastAsia="宋体" w:hAnsi="Times New Roman" w:cs="Times New Roman"/>
+          <w:kern w:val="0"/>
+          <w:szCs w:val="21"/>
+        </w:rPr>
+        <w:t>Peña-Corona S I, et al. Comprehensive Evaluation and Future Perspectives of Non-Surgical Contraceptive Methods in Female Cats and Dogs[J]. Animals, 2025, 15(10): 1501.</w:t>
+      </w:r>
+      <w:bookmarkEnd w:id="8"/>
     </w:p>
     <w:p>
       <w:pPr>
         <w:pStyle w:val="a7"/>
-        <w:widowControl/>
         <w:numPr>
           <w:ilvl w:val="0"/>
-          <w:numId w:val="1"/>
+          <w:numId w:val="2"/>
         </w:numPr>
-        <w:spacing w:line="360" w:lineRule="exact"/>
         <w:ind w:firstLineChars="0"/>
-        <w:jc w:val="left"/>
-        <w:rPr>
-          <w:rFonts w:ascii="Times New Roman" w:eastAsia="宋体" w:hAnsi="Times New Roman" w:cs="Times New Roman"/>
-          <w:kern w:val="0"/>
-          <w:szCs w:val="21"/>
-        </w:rPr>
-      </w:pPr>
-      <w:bookmarkStart w:id="4" w:name="_Ref228003549"/>
-      <w:r>
-        <w:rPr>
-          <w:rFonts w:ascii="Times New Roman" w:eastAsia="宋体" w:hAnsi="Times New Roman" w:cs="Times New Roman"/>
-          <w:kern w:val="0"/>
-          <w:szCs w:val="21"/>
-        </w:rPr>
-        <w:t>Beauvais W, Cardwell J M, Brodbelt D C. The effect of neutering on the risk of mammary tumours in dogs: a systematic review[J]. Journal of Small Animal Practice, 2012, 53(6): 314-322.</w:t>
-      </w:r>
-      <w:bookmarkEnd w:id="4"/>
+        <w:rPr>
+          <w:rFonts w:ascii="Times New Roman" w:eastAsia="宋体" w:hAnsi="Times New Roman" w:cs="Times New Roman"/>
+          <w:kern w:val="0"/>
+          <w:szCs w:val="21"/>
+        </w:rPr>
+      </w:pPr>
+      <w:bookmarkStart w:id="9" w:name="_Ref228545823"/>
+      <w:r>
+        <w:rPr>
+          <w:rFonts w:ascii="Times New Roman" w:eastAsia="宋体" w:hAnsi="Times New Roman" w:cs="Times New Roman"/>
+          <w:kern w:val="0"/>
+          <w:szCs w:val="21"/>
+        </w:rPr>
+        <w:t>Asa C S. Contraception in Dogs and Cats[J]. Veterinary Clinics of North America: Small Animal Practice, 2018, 48(4): 733-742.</w:t>
+      </w:r>
+      <w:bookmarkEnd w:id="9"/>
+      <w:r>
+        <w:rPr>
+          <w:rFonts w:ascii="Times New Roman" w:eastAsia="宋体" w:hAnsi="Times New Roman" w:cs="Times New Roman"/>
+          <w:kern w:val="0"/>
+          <w:szCs w:val="21"/>
+        </w:rPr>
+        <w:t xml:space="preserve"> </w:t>
+      </w:r>
     </w:p>
     <w:p>
       <w:pPr>
         <w:pStyle w:val="a7"/>
-        <w:widowControl/>
         <w:numPr>
           <w:ilvl w:val="0"/>
-          <w:numId w:val="1"/>
+          <w:numId w:val="2"/>
         </w:numPr>
-        <w:spacing w:line="360" w:lineRule="exact"/>
         <w:ind w:firstLineChars="0"/>
-        <w:jc w:val="left"/>
-        <w:rPr>
-          <w:rFonts w:ascii="Times New Roman" w:eastAsia="宋体" w:hAnsi="Times New Roman" w:cs="Times New Roman"/>
-          <w:kern w:val="0"/>
-          <w:szCs w:val="21"/>
-        </w:rPr>
-      </w:pPr>
-      <w:bookmarkStart w:id="5" w:name="_Ref228003584"/>
-      <w:r>
-        <w:rPr>
-          <w:rFonts w:ascii="Times New Roman" w:eastAsia="宋体" w:hAnsi="Times New Roman" w:cs="Times New Roman"/>
-          <w:kern w:val="0"/>
-          <w:szCs w:val="21"/>
-        </w:rPr>
-        <w:t>Fontaine C. A review of Suprelorin (deslorelin) studies in cats[J]. Journal of Feline Medicine and Surgery, 2015, 17(9): 766-771.</w:t>
-      </w:r>
-      <w:bookmarkEnd w:id="5"/>
-    </w:p>
-    <w:p>
-      <w:pPr>
-        <w:pStyle w:val="a7"/>
-        <w:widowControl/>
-        <w:numPr>
-          <w:ilvl w:val="0"/>
-          <w:numId w:val="1"/>
-        </w:numPr>
-        <w:spacing w:line="360" w:lineRule="exact"/>
-        <w:ind w:firstLineChars="0"/>
-        <w:jc w:val="left"/>
-        <w:rPr>
-          <w:rFonts w:ascii="Times New Roman" w:eastAsia="宋体" w:hAnsi="Times New Roman" w:cs="Times New Roman"/>
-          <w:kern w:val="0"/>
-          <w:szCs w:val="21"/>
-        </w:rPr>
-      </w:pPr>
-      <w:bookmarkStart w:id="6" w:name="_Ref228003602"/>
-      <w:r>
-        <w:rPr>
-          <w:rFonts w:ascii="Times New Roman" w:eastAsia="宋体" w:hAnsi="Times New Roman" w:cs="Times New Roman"/>
-          <w:kern w:val="0"/>
-          <w:szCs w:val="21"/>
-        </w:rPr>
-        <w:t>Amaral J, Gontier A, Fontaine C, et al. Efficacy and Safety of 4.7 mg Deslorelin Acetate Implants as a Neutering Option in Male Cats[J]. Animals, 2023, 13(4): 704.</w:t>
-      </w:r>
-      <w:bookmarkEnd w:id="6"/>
-    </w:p>
-    <w:p>
-      <w:pPr>
-        <w:pStyle w:val="a7"/>
-        <w:widowControl/>
-        <w:numPr>
-          <w:ilvl w:val="0"/>
-          <w:numId w:val="1"/>
-        </w:numPr>
-        <w:spacing w:line="360" w:lineRule="exact"/>
-        <w:ind w:firstLineChars="0"/>
-        <w:jc w:val="left"/>
-        <w:rPr>
-          <w:rFonts w:ascii="Times New Roman" w:eastAsia="宋体" w:hAnsi="Times New Roman" w:cs="Times New Roman"/>
-          <w:kern w:val="0"/>
-          <w:szCs w:val="21"/>
-        </w:rPr>
-      </w:pPr>
-      <w:bookmarkStart w:id="7" w:name="_Ref228003617"/>
-      <w:r>
-        <w:rPr>
-          <w:rFonts w:ascii="Times New Roman" w:eastAsia="宋体" w:hAnsi="Times New Roman" w:cs="Times New Roman"/>
-          <w:kern w:val="0"/>
-          <w:szCs w:val="21"/>
-        </w:rPr>
-        <w:t>Driancourt M A, Farrell A, Schoonjans F, et al. Gonadotropin-Releasing Hormone (GnRH) Agonist Implants for Male Dog Fertility Control: A Review[J]. Animals, 2020, 10(8): 1307.</w:t>
-      </w:r>
-      <w:bookmarkEnd w:id="7"/>
-    </w:p>
-    <w:p>
-      <w:pPr>
-        <w:pStyle w:val="a7"/>
-        <w:widowControl/>
-        <w:numPr>
-          <w:ilvl w:val="0"/>
-          <w:numId w:val="1"/>
-        </w:numPr>
-        <w:spacing w:line="360" w:lineRule="exact"/>
-        <w:ind w:firstLineChars="0"/>
-        <w:jc w:val="left"/>
-        <w:rPr>
-          <w:rFonts w:ascii="Times New Roman" w:eastAsia="宋体" w:hAnsi="Times New Roman" w:cs="Times New Roman"/>
-          <w:kern w:val="0"/>
-          <w:szCs w:val="21"/>
-        </w:rPr>
-      </w:pPr>
-      <w:bookmarkStart w:id="8" w:name="_Ref228003630"/>
-      <w:r>
-        <w:rPr>
-          <w:rFonts w:ascii="Times New Roman" w:eastAsia="宋体" w:hAnsi="Times New Roman" w:cs="Times New Roman"/>
-          <w:kern w:val="0"/>
-          <w:szCs w:val="21"/>
-        </w:rPr>
-        <w:t>Peña-Corona S I, et al. Comprehensive Evaluation and Future Perspectives of Non-Surgical Contraceptive Methods in Female Cats and Dogs[J]. Animals, 2025, 15(10): 1501.</w:t>
-      </w:r>
-      <w:bookmarkEnd w:id="8"/>
-    </w:p>
-    <w:p>
-      <w:pPr>
-        <w:pStyle w:val="a7"/>
-        <w:widowControl/>
-        <w:numPr>
-          <w:ilvl w:val="0"/>
-          <w:numId w:val="1"/>
-        </w:numPr>
-        <w:spacing w:line="360" w:lineRule="exact"/>
-        <w:ind w:firstLineChars="0"/>
-        <w:jc w:val="left"/>
-        <w:rPr>
-          <w:rFonts w:ascii="Times New Roman" w:eastAsia="宋体" w:hAnsi="Times New Roman" w:cs="Times New Roman"/>
-          <w:kern w:val="0"/>
-          <w:szCs w:val="21"/>
-        </w:rPr>
-      </w:pPr>
-      <w:bookmarkStart w:id="9" w:name="_Ref228003644"/>
-      <w:r>
-        <w:rPr>
-          <w:rFonts w:ascii="Times New Roman" w:eastAsia="宋体" w:hAnsi="Times New Roman" w:cs="Times New Roman"/>
-          <w:kern w:val="0"/>
-          <w:szCs w:val="21"/>
-        </w:rPr>
-        <w:t>Asa C S, Porton I J. Contraception in Dogs and Cats[J]. Veterinary Clinics of North America: Small Animal Practice, 2018, 48(4): 733-742.</w:t>
-      </w:r>
-      <w:bookmarkEnd w:id="9"/>
-    </w:p>
-    <w:p>
-      <w:pPr>
-        <w:pStyle w:val="a7"/>
-        <w:widowControl/>
-        <w:numPr>
-          <w:ilvl w:val="0"/>
-          <w:numId w:val="1"/>
-        </w:numPr>
-        <w:spacing w:line="360" w:lineRule="exact"/>
-        <w:ind w:firstLineChars="0"/>
-        <w:jc w:val="left"/>
-        <w:rPr>
-          <w:rFonts w:ascii="Times New Roman" w:eastAsia="宋体" w:hAnsi="Times New Roman" w:cs="Times New Roman"/>
-          <w:kern w:val="0"/>
-          <w:szCs w:val="21"/>
-        </w:rPr>
-      </w:pPr>
-      <w:bookmarkStart w:id="10" w:name="_Ref228003665"/>
-      <w:r>
-        <w:rPr>
-          <w:rFonts w:ascii="Times New Roman" w:eastAsia="宋体" w:hAnsi="Times New Roman" w:cs="Times New Roman"/>
-          <w:kern w:val="0"/>
-          <w:szCs w:val="21"/>
-        </w:rPr>
-        <w:t>Norsworthy G D, et al. Use of megestrol in cats[J]. Journal of Feline Medicine and Surgery Open Reports, 2016, 2(1): 2055116916645349.</w:t>
-      </w:r>
-      <w:bookmarkEnd w:id="10"/>
-    </w:p>
-    <w:p>
-      <w:pPr>
-        <w:pStyle w:val="a7"/>
-        <w:widowControl/>
-        <w:numPr>
-          <w:ilvl w:val="0"/>
-          <w:numId w:val="1"/>
-        </w:numPr>
-        <w:spacing w:line="360" w:lineRule="exact"/>
-        <w:ind w:firstLineChars="0"/>
-        <w:jc w:val="left"/>
-        <w:rPr>
-          <w:rFonts w:ascii="Times New Roman" w:eastAsia="宋体" w:hAnsi="Times New Roman" w:cs="Times New Roman"/>
-          <w:kern w:val="0"/>
-          <w:szCs w:val="21"/>
-        </w:rPr>
-      </w:pPr>
-      <w:bookmarkStart w:id="11" w:name="_Ref228003686"/>
-      <w:r>
-        <w:rPr>
-          <w:rFonts w:ascii="Times New Roman" w:eastAsia="宋体" w:hAnsi="Times New Roman" w:cs="Times New Roman"/>
-          <w:kern w:val="0"/>
-          <w:szCs w:val="21"/>
-        </w:rPr>
-        <w:t>Stempel S, Gasse H, Kutzler M, et al. What Happens in Male Dogs after Treatment with a 4.7 mg Deslorelin Implant? A Review of the Literature[J]. Animals, 2022, 12(18): 2412.</w:t>
-      </w:r>
-      <w:bookmarkEnd w:id="11"/>
-    </w:p>
-    <w:p>
-      <w:pPr>
         <w:rPr>
           <w:sz w:val="24"/>
           <w:szCs w:val="28"/>
         </w:rPr>
       </w:pPr>
+      <w:bookmarkStart w:id="10" w:name="_Ref228545828"/>
+      <w:proofErr w:type="spellStart"/>
+      <w:r>
+        <w:rPr>
+          <w:rFonts w:ascii="Times New Roman" w:eastAsia="宋体" w:hAnsi="Times New Roman" w:cs="Times New Roman"/>
+          <w:kern w:val="0"/>
+          <w:szCs w:val="21"/>
+        </w:rPr>
+        <w:t>Stempel</w:t>
+      </w:r>
+      <w:proofErr w:type="spellEnd"/>
+      <w:r>
+        <w:rPr>
+          <w:rFonts w:ascii="Times New Roman" w:eastAsia="宋体" w:hAnsi="Times New Roman" w:cs="Times New Roman"/>
+          <w:kern w:val="0"/>
+          <w:szCs w:val="21"/>
+        </w:rPr>
+        <w:t xml:space="preserve"> S, </w:t>
+      </w:r>
+      <w:proofErr w:type="spellStart"/>
+      <w:r>
+        <w:rPr>
+          <w:rFonts w:ascii="Times New Roman" w:eastAsia="宋体" w:hAnsi="Times New Roman" w:cs="Times New Roman"/>
+          <w:kern w:val="0"/>
+          <w:szCs w:val="21"/>
+        </w:rPr>
+        <w:t>Gasse</w:t>
+      </w:r>
+      <w:proofErr w:type="spellEnd"/>
+      <w:r>
+        <w:rPr>
+          <w:rFonts w:ascii="Times New Roman" w:eastAsia="宋体" w:hAnsi="Times New Roman" w:cs="Times New Roman"/>
+          <w:kern w:val="0"/>
+          <w:szCs w:val="21"/>
+        </w:rPr>
+        <w:t xml:space="preserve"> H, </w:t>
+      </w:r>
+      <w:proofErr w:type="spellStart"/>
+      <w:r>
+        <w:rPr>
+          <w:rFonts w:ascii="Times New Roman" w:eastAsia="宋体" w:hAnsi="Times New Roman" w:cs="Times New Roman"/>
+          <w:kern w:val="0"/>
+          <w:szCs w:val="21"/>
+        </w:rPr>
+        <w:t>Kutzler</w:t>
+      </w:r>
+      <w:proofErr w:type="spellEnd"/>
+      <w:r>
+        <w:rPr>
+          <w:rFonts w:ascii="Times New Roman" w:eastAsia="宋体" w:hAnsi="Times New Roman" w:cs="Times New Roman"/>
+          <w:kern w:val="0"/>
+          <w:szCs w:val="21"/>
+        </w:rPr>
+        <w:t xml:space="preserve"> M, et al. What Happens in Male Dogs after Treatment with a 4.7 mg </w:t>
+      </w:r>
+      <w:proofErr w:type="spellStart"/>
+      <w:r>
+        <w:rPr>
+          <w:rFonts w:ascii="Times New Roman" w:eastAsia="宋体" w:hAnsi="Times New Roman" w:cs="Times New Roman"/>
+          <w:kern w:val="0"/>
+          <w:szCs w:val="21"/>
+        </w:rPr>
+        <w:t>Deslorelin</w:t>
+      </w:r>
+      <w:proofErr w:type="spellEnd"/>
+      <w:r>
+        <w:rPr>
+          <w:rFonts w:ascii="Times New Roman" w:eastAsia="宋体" w:hAnsi="Times New Roman" w:cs="Times New Roman"/>
+          <w:kern w:val="0"/>
+          <w:szCs w:val="21"/>
+        </w:rPr>
+        <w:t xml:space="preserve"> Implant? </w:t>
+      </w:r>
+      <w:r>
+        <w:rPr>
+          <w:rFonts w:ascii="Times New Roman" w:eastAsia="宋体" w:hAnsi="Times New Roman" w:cs="Times New Roman"/>
+          <w:kern w:val="0"/>
+          <w:szCs w:val="21"/>
+        </w:rPr>
+        <w:t xml:space="preserve">I. Flare up and Downregulation. </w:t>
+      </w:r>
+      <w:r>
+        <w:rPr>
+          <w:rFonts w:ascii="Times New Roman" w:eastAsia="宋体" w:hAnsi="Times New Roman" w:cs="Times New Roman"/>
+          <w:kern w:val="0"/>
+          <w:szCs w:val="21"/>
+        </w:rPr>
+        <w:t>[J]. Animals, 2022, 12(18): 2379.</w:t>
+      </w:r>
+      <w:bookmarkEnd w:id="10"/>
     </w:p>
     <w:sectPr>
       <w:pgSz w:w="11906" w:h="16838" w:code="9"/>
@@ -2408,6 +2710,96 @@
 <file path=word/numbering.xml><?xml version="1.0" encoding="utf-8"?>
 <w:numbering xmlns:wpc="http://schemas.microsoft.com/office/word/2010/wordprocessingCanvas" xmlns:cx="http://schemas.microsoft.com/office/drawing/2014/chartex" xmlns:cx1="http://schemas.microsoft.com/office/drawing/2015/9/8/chartex" xmlns:cx2="http://schemas.microsoft.com/office/drawing/2015/10/21/chartex" xmlns:cx3="http://schemas.microsoft.com/office/drawing/2016/5/9/chartex" xmlns:cx4="http://schemas.microsoft.com/office/drawing/2016/5/10/chartex" xmlns:cx5="http://schemas.microsoft.com/office/drawing/2016/5/11/chartex" xmlns:cx6="http://schemas.microsoft.com/office/drawing/2016/5/12/chartex" xmlns:cx7="http://schemas.microsoft.com/office/drawing/2016/5/13/chartex" xmlns:cx8="http://schemas.microsoft.com/office/drawing/2016/5/14/chartex" xmlns:mc="http://schemas.openxmlformats.org/markup-compatibility/2006" xmlns:aink="http://schemas.microsoft.com/office/drawing/2016/ink" xmlns:am3d="http://schemas.microsoft.com/office/drawing/2017/model3d" xmlns:o="urn:schemas-microsoft-com:office:office" xmlns:r="http://schemas.openxmlformats.org/officeDocument/2006/relationships" xmlns:m="http://schemas.openxmlformats.org/officeDocument/2006/math" xmlns:v="urn:schemas-microsoft-com:vml" xmlns:wp14="http://schemas.microsoft.com/office/word/2010/wordprocessingDrawing" xmlns:wp="http://schemas.openxmlformats.org/drawingml/2006/wordprocessingDrawing" xmlns:w10="urn:schemas-microsoft-com:office:word" xmlns:w="http://schemas.openxmlformats.org/wordprocessingml/2006/main" xmlns:w14="http://schemas.microsoft.com/office/word/2010/wordml" xmlns:w15="http://schemas.microsoft.com/office/word/2012/wordml" xmlns:w16cex="http://schemas.microsoft.com/office/word/2018/wordml/cex" xmlns:w16cid="http://schemas.microsoft.com/office/word/2016/wordml/cid" xmlns:w16="http://schemas.microsoft.com/office/word/2018/wordml" xmlns:w16sdtdh="http://schemas.microsoft.com/office/word/2020/wordml/sdtdatahash" xmlns:w16se="http://schemas.microsoft.com/office/word/2015/wordml/symex" xmlns:wpg="http://schemas.microsoft.com/office/word/2010/wordprocessingGroup" xmlns:wpi="http://schemas.microsoft.com/office/word/2010/wordprocessingInk" xmlns:wne="http://schemas.microsoft.com/office/word/2006/wordml" xmlns:wps="http://schemas.microsoft.com/office/word/2010/wordprocessingShape" mc:Ignorable="w14 w15 w16se w16cid w16 w16cex w16sdtdh wp14">
   <w:abstractNum w:abstractNumId="0" w15:restartNumberingAfterBreak="0">
+    <w:nsid w:val="10CC1BEA"/>
+    <w:multiLevelType w:val="hybridMultilevel"/>
+    <w:tmpl w:val="D6FABB1C"/>
+    <w:lvl w:ilvl="0" w:tplc="C9569CA0">
+      <w:start w:val="1"/>
+      <w:numFmt w:val="decimal"/>
+      <w:suff w:val="space"/>
+      <w:lvlText w:val="[%1]"/>
+      <w:lvlJc w:val="left"/>
+      <w:pPr>
+        <w:ind w:left="0" w:firstLine="0"/>
+      </w:pPr>
+      <w:rPr>
+        <w:rFonts w:ascii="Times New Roman" w:hAnsi="Times New Roman" w:cs="Times New Roman" w:hint="default"/>
+      </w:rPr>
+    </w:lvl>
+    <w:lvl w:ilvl="1" w:tplc="04090019" w:tentative="1">
+      <w:start w:val="1"/>
+      <w:numFmt w:val="lowerLetter"/>
+      <w:lvlText w:val="%2)"/>
+      <w:lvlJc w:val="left"/>
+      <w:pPr>
+        <w:ind w:left="840" w:hanging="420"/>
+      </w:pPr>
+    </w:lvl>
+    <w:lvl w:ilvl="2" w:tplc="0409001B" w:tentative="1">
+      <w:start w:val="1"/>
+      <w:numFmt w:val="lowerRoman"/>
+      <w:lvlText w:val="%3."/>
+      <w:lvlJc w:val="right"/>
+      <w:pPr>
+        <w:ind w:left="1260" w:hanging="420"/>
+      </w:pPr>
+    </w:lvl>
+    <w:lvl w:ilvl="3" w:tplc="0409000F" w:tentative="1">
+      <w:start w:val="1"/>
+      <w:numFmt w:val="decimal"/>
+      <w:lvlText w:val="%4."/>
+      <w:lvlJc w:val="left"/>
+      <w:pPr>
+        <w:ind w:left="1680" w:hanging="420"/>
+      </w:pPr>
+    </w:lvl>
+    <w:lvl w:ilvl="4" w:tplc="04090019" w:tentative="1">
+      <w:start w:val="1"/>
+      <w:numFmt w:val="lowerLetter"/>
+      <w:lvlText w:val="%5)"/>
+      <w:lvlJc w:val="left"/>
+      <w:pPr>
+        <w:ind w:left="2100" w:hanging="420"/>
+      </w:pPr>
+    </w:lvl>
+    <w:lvl w:ilvl="5" w:tplc="0409001B" w:tentative="1">
+      <w:start w:val="1"/>
+      <w:numFmt w:val="lowerRoman"/>
+      <w:lvlText w:val="%6."/>
+      <w:lvlJc w:val="right"/>
+      <w:pPr>
+        <w:ind w:left="2520" w:hanging="420"/>
+      </w:pPr>
+    </w:lvl>
+    <w:lvl w:ilvl="6" w:tplc="0409000F" w:tentative="1">
+      <w:start w:val="1"/>
+      <w:numFmt w:val="decimal"/>
+      <w:lvlText w:val="%7."/>
+      <w:lvlJc w:val="left"/>
+      <w:pPr>
+        <w:ind w:left="2940" w:hanging="420"/>
+      </w:pPr>
+    </w:lvl>
+    <w:lvl w:ilvl="7" w:tplc="04090019" w:tentative="1">
+      <w:start w:val="1"/>
+      <w:numFmt w:val="lowerLetter"/>
+      <w:lvlText w:val="%8)"/>
+      <w:lvlJc w:val="left"/>
+      <w:pPr>
+        <w:ind w:left="3360" w:hanging="420"/>
+      </w:pPr>
+    </w:lvl>
+    <w:lvl w:ilvl="8" w:tplc="0409001B" w:tentative="1">
+      <w:start w:val="1"/>
+      <w:numFmt w:val="lowerRoman"/>
+      <w:lvlText w:val="%9."/>
+      <w:lvlJc w:val="right"/>
+      <w:pPr>
+        <w:ind w:left="3780" w:hanging="420"/>
+      </w:pPr>
+    </w:lvl>
+  </w:abstractNum>
+  <w:abstractNum w:abstractNumId="1" w15:restartNumberingAfterBreak="0">
     <w:nsid w:val="22B76D08"/>
     <w:multiLevelType w:val="hybridMultilevel"/>
     <w:tmpl w:val="15408630"/>
@@ -2498,6 +2890,9 @@
     </w:lvl>
   </w:abstractNum>
   <w:num w:numId="1">
+    <w:abstractNumId w:val="1"/>
+  </w:num>
+  <w:num w:numId="2">
     <w:abstractNumId w:val="0"/>
   </w:num>
 </w:numbering>
@@ -2906,6 +3301,7 @@
   <w:style w:type="character" w:default="1" w:styleId="a0">
     <w:name w:val="Default Paragraph Font"/>
     <w:uiPriority w:val="1"/>
+    <w:semiHidden/>
     <w:unhideWhenUsed/>
   </w:style>
   <w:style w:type="table" w:default="1" w:styleId="a1">

</xml_diff>